<commit_message>
Revisión detallada de los zips: textos viejos y diagramación de los PDF
Errata «Requerimentos»; el índice y las fechas de la Modalidad; la Garantía
en la Estimación; el estado al 20/10 en la Guía de los Bloques C y D, las
Conexiones de las plaquetas y el Estado; el capacitor de 470 µF en las
planillas y la Guía del Bloque A; los precios que faltan en la Tabla 15.
En los PDF, columnas más anchas donde se cortaban palabras, la Tabla 14 junto
a su epígrafe y sin renglones estirados antes de un salto manual.

Co-Authored-By: Claude Opus 5.5 <noreply@anthropic.com>
Claude-Session: https://claude.ai/code/session_01QiY8ZZNAM9gwPKiqSkCaaj
</commit_message>
<xml_diff>
--- a/documentacion_proyecto/Conexiones_de_las_plaquetas.docx
+++ b/documentacion_proyecto/Conexiones_de_las_plaquetas.docx
@@ -47,7 +47,7 @@
         <w:t xml:space="preserve">cómo va conectado todo</w:t>
       </w:r>
       <w:r>
-        <w:t xml:space="preserve">: qué lleva cada plaqueta, qué hilos pasan por cada conector, a qué pin del ESP32 va cada señal y qué hay que corregir del diseño actual en Proteus. La guía completa es «Guía de conexión y puesta en marcha» (sección 3 y 4). Si algo de acá no coincide con el firmware (config.h), manda el firmware: avisar antes de soldar.</w:t>
+        <w:t xml:space="preserve">: qué lleva cada plaqueta, qué hilos pasan por cada conector, a qué pin del ESP32 va cada señal y qué se marcó para corregir del diseño en Proteus antes de soldar (16/10/2026). Las cinco plaquetas quedaron soldadas el 20/10/2026: las secciones 5 y 6 quedan como registro de esa revisión. La guía completa es «Guía de conexión y puesta en marcha» (sección 3 y 4). Si algo de acá no coincide con el firmware (config.h), manda el firmware: avisar antes de soldar.</w:t>
       </w:r>
     </w:p>
     <w:p>
@@ -6281,7 +6281,7 @@
         <w:keepNext/>
       </w:pPr>
       <w:r>
-        <w:t xml:space="preserve">6. Lo que todavía hay que decidir juntos</w:t>
+        <w:t xml:space="preserve">6. Lo que quedaba por decidir antes de soldar</w:t>
       </w:r>
     </w:p>
     <w:p>

</xml_diff>